<commit_message>
Added AI disclaimer on dashboard
</commit_message>
<xml_diff>
--- a/Water_Quality_IoT_Documentation.docx
+++ b/Water_Quality_IoT_Documentation.docx
@@ -528,15 +528,7 @@
                 <w:color w:val="FFFFFF"/>
                 <w:sz w:val="20"/>
               </w:rPr>
-              <w:t>Pop Patric</w:t>
-            </w:r>
-            <w:r>
-              <w:rPr>
-                <w:b/>
-                <w:color w:val="FFFFFF"/>
-                <w:sz w:val="20"/>
-              </w:rPr>
-              <w:t xml:space="preserve"> (Hardware &amp; Cloud)</w:t>
+              <w:t>Pop Patric (Hardware &amp; Cloud)</w:t>
             </w:r>
           </w:p>
         </w:tc>
@@ -555,15 +547,7 @@
                 <w:color w:val="FFFFFF"/>
                 <w:sz w:val="20"/>
               </w:rPr>
-              <w:t>Cristea Laur Alexandru</w:t>
-            </w:r>
-            <w:r>
-              <w:rPr>
-                <w:b/>
-                <w:color w:val="FFFFFF"/>
-                <w:sz w:val="20"/>
-              </w:rPr>
-              <w:t xml:space="preserve"> (Backend &amp; Frontend)</w:t>
+              <w:t>Cristea Laur Alexandru (Backend &amp; Frontend)</w:t>
             </w:r>
           </w:p>
         </w:tc>
@@ -4206,7 +4190,26 @@
     </w:p>
     <w:p>
       <w:r>
-        <w:t>The dashboard is a single-page application built with Bootstrap 5 and Chart.js 4. It auto-refreshes every 10 seconds using JavaScript fetch() calls to the API endpoints. Features include colour-coded sensor cards, rolling line charts, an anomaly indicators panel with per-sensor attribution, and an alert log.</w:t>
+        <w:t xml:space="preserve">The dashboard is a single-page application built with Bootstrap 5 and Chart.js 4. It auto-refreshes every 10 seconds using JavaScript fetch() calls to the API endpoints. Features include </w:t>
+      </w:r>
+      <w:proofErr w:type="spellStart"/>
+      <w:r>
+        <w:t>colour</w:t>
+      </w:r>
+      <w:proofErr w:type="spellEnd"/>
+      <w:r>
+        <w:t xml:space="preserve">-coded sensor </w:t>
+      </w:r>
+      <w:proofErr w:type="spellStart"/>
+      <w:r>
+        <w:t>ate</w:t>
+      </w:r>
+      <w:r>
+        <w:t>cards</w:t>
+      </w:r>
+      <w:proofErr w:type="spellEnd"/>
+      <w:r>
+        <w:t>, rolling line charts, an anomaly indicators panel with per-sensor attribution, and an alert log.</w:t>
       </w:r>
     </w:p>
     <w:p>
@@ -4698,6 +4701,9 @@
       </w:pPr>
       <w:r>
         <w:t>4.1 Sensor Testing and Calibration Validation</w:t>
+      </w:r>
+      <w:r>
+        <w:t xml:space="preserve"> </w:t>
       </w:r>
     </w:p>
     <w:p>
@@ -5506,7 +5512,13 @@
         <w:t xml:space="preserve">Documentation: </w:t>
       </w:r>
       <w:r>
-        <w:t>Generating project documentation, including this document, and maintaining the PROJECT_CONTEXT.md file as a living reference for the project.</w:t>
+        <w:t>Generating project documentation</w:t>
+      </w:r>
+      <w:r>
+        <w:t xml:space="preserve"> for each step to understand the workflow and work split better</w:t>
+      </w:r>
+      <w:r>
+        <w:t xml:space="preserve"> and maintaining the PROJECT_CONTEXT.md file as a living reference for the project.</w:t>
       </w:r>
     </w:p>
     <w:p/>

</xml_diff>